<commit_message>
Add dorm takeaway MVP app and project docs
</commit_message>
<xml_diff>
--- a/Week1_Meeting_Minutes.docx
+++ b/Week1_Meeting_Minutes.docx
@@ -15,8 +15,6 @@
         </w:rPr>
         <w:t>Week 1 Meeting Minutes</w:t>
       </w:r>
-      <w:bookmarkStart w:id="0" w:name="_GoBack"/>
-      <w:bookmarkEnd w:id="0"/>
     </w:p>
     <w:p>
       <w:pPr>
@@ -70,6 +68,8 @@
         </w:rPr>
         <w:t>Attendees and Roles</w:t>
       </w:r>
+      <w:bookmarkStart w:id="0" w:name="_GoBack"/>
+      <w:bookmarkEnd w:id="0"/>
     </w:p>
     <w:p>
       <w:pPr>
@@ -80,9 +80,16 @@
       </w:pPr>
       <w:r>
         <w:rPr>
+          <w:rFonts w:hint="eastAsia" w:ascii="Times New Roman Regular" w:hAnsi="Times New Roman Regular" w:eastAsia="宋体" w:cs="Times New Roman Regular"/>
+          <w:lang w:val="en-US" w:eastAsia="zh-CN"/>
+        </w:rPr>
+        <w:t>Tao J</w:t>
+      </w:r>
+      <w:r>
+        <w:rPr>
           <w:rFonts w:hint="default" w:ascii="Times New Roman Regular" w:hAnsi="Times New Roman Regular" w:cs="Times New Roman Regular"/>
         </w:rPr>
-        <w:t>taojiacheng - Team Leader</w:t>
+        <w:t>iacheng - Team Leader</w:t>
       </w:r>
     </w:p>
     <w:p>
@@ -96,7 +103,7 @@
         <w:rPr>
           <w:rFonts w:hint="default" w:ascii="Times New Roman Regular" w:hAnsi="Times New Roman Regular" w:cs="Times New Roman Regular"/>
         </w:rPr>
-        <w:t>Member 2 - Product Owner</w:t>
+        <w:t>Liu Pengyang - Product Owner</w:t>
       </w:r>
     </w:p>
     <w:p>
@@ -110,7 +117,7 @@
         <w:rPr>
           <w:rFonts w:hint="default" w:ascii="Times New Roman Regular" w:hAnsi="Times New Roman Regular" w:cs="Times New Roman Regular"/>
         </w:rPr>
-        <w:t>Member 3 - Quality Controller</w:t>
+        <w:t>Wu Sicheng - Quality Controller</w:t>
       </w:r>
     </w:p>
     <w:p>
@@ -124,7 +131,7 @@
         <w:rPr>
           <w:rFonts w:hint="default" w:ascii="Times New Roman Regular" w:hAnsi="Times New Roman Regular" w:cs="Times New Roman Regular"/>
         </w:rPr>
-        <w:t>Member 4 - Team Member (Development)</w:t>
+        <w:t>Dang xiaofeng - Team Member (Development)</w:t>
       </w:r>
     </w:p>
     <w:p>
@@ -138,7 +145,7 @@
         <w:rPr>
           <w:rFonts w:hint="default" w:ascii="Times New Roman Regular" w:hAnsi="Times New Roman Regular" w:cs="Times New Roman Regular"/>
         </w:rPr>
-        <w:t>Member 5 - Team Member (Development)</w:t>
+        <w:t>Ma Ruilin - Team Member (Development)</w:t>
       </w:r>
     </w:p>
     <w:p>

</xml_diff>